<commit_message>
Added more clean and clear captions to the word document
</commit_message>
<xml_diff>
--- a/shara88_checkpoint1_s12026 (2).docx
+++ b/shara88_checkpoint1_s12026 (2).docx
@@ -4,13 +4,67 @@
   <w:body>
     <w:p>
       <w:pPr>
-        <w:rPr>
-          <w:rFonts w:ascii="Arial" w:hAnsi="Arial" w:cs="Arial"/>
-        </w:rPr>
-      </w:pPr>
-      <w:r>
-        <w:rPr>
-          <w:rFonts w:ascii="Arial" w:hAnsi="Arial" w:cs="Arial"/>
+        <w:jc w:val="center"/>
+        <w:rPr>
+          <w:rFonts w:ascii="Arial" w:hAnsi="Arial" w:cs="Arial"/>
+          <w:b/>
+          <w:bCs/>
+          <w:sz w:val="60"/>
+          <w:szCs w:val="60"/>
+          <w:u w:val="single"/>
+        </w:rPr>
+      </w:pPr>
+      <w:r>
+        <w:rPr>
+          <w:rFonts w:ascii="Arial" w:hAnsi="Arial" w:cs="Arial"/>
+          <w:b/>
+          <w:bCs/>
+          <w:sz w:val="60"/>
+          <w:szCs w:val="60"/>
+          <w:u w:val="single"/>
+        </w:rPr>
+        <w:t>OSC Check Point 1</w:t>
+      </w:r>
+    </w:p>
+    <w:p>
+      <w:pPr>
+        <w:rPr>
+          <w:rFonts w:ascii="Arial" w:hAnsi="Arial" w:cs="Arial"/>
+          <w:sz w:val="40"/>
+          <w:szCs w:val="40"/>
+        </w:rPr>
+      </w:pPr>
+      <w:r>
+        <w:rPr>
+          <w:rFonts w:ascii="Arial" w:hAnsi="Arial" w:cs="Arial"/>
+          <w:sz w:val="40"/>
+          <w:szCs w:val="40"/>
+        </w:rPr>
+        <w:t xml:space="preserve">This document contains the screenshots and the explanation for the screenshots for the checkpoint one. </w:t>
+      </w:r>
+    </w:p>
+    <w:p>
+      <w:pPr>
+        <w:rPr>
+          <w:rFonts w:ascii="Arial" w:hAnsi="Arial" w:cs="Arial"/>
+          <w:b/>
+          <w:bCs/>
+        </w:rPr>
+      </w:pPr>
+    </w:p>
+    <w:p>
+      <w:pPr>
+        <w:rPr>
+          <w:rFonts w:ascii="Arial" w:hAnsi="Arial" w:cs="Arial"/>
+          <w:b/>
+          <w:bCs/>
+        </w:rPr>
+      </w:pPr>
+      <w:r>
+        <w:rPr>
+          <w:rFonts w:ascii="Arial" w:hAnsi="Arial" w:cs="Arial"/>
+          <w:b/>
+          <w:bCs/>
         </w:rPr>
         <w:t xml:space="preserve">Task 1: Connect to your Azure VM and set up your account </w:t>
       </w:r>
@@ -19,37 +73,36 @@
       <w:pPr>
         <w:rPr>
           <w:rFonts w:ascii="Arial" w:hAnsi="Arial" w:cs="Arial"/>
-        </w:rPr>
-      </w:pPr>
-      <w:r>
-        <w:rPr>
-          <w:rFonts w:ascii="Arial" w:hAnsi="Arial" w:cs="Arial"/>
-        </w:rPr>
-        <w:t xml:space="preserve">1.1 </w:t>
-      </w:r>
-      <w:r>
-        <w:rPr>
-          <w:rFonts w:ascii="Arial" w:hAnsi="Arial" w:cs="Arial"/>
-        </w:rPr>
-        <w:t>Retrieve your VM Public IP Address [2 marks]</w:t>
-      </w:r>
-    </w:p>
-    <w:p>
-      <w:pPr>
-        <w:rPr>
-          <w:rFonts w:ascii="Arial" w:hAnsi="Arial" w:cs="Arial"/>
-        </w:rPr>
-      </w:pPr>
-    </w:p>
-    <w:p>
-      <w:pPr>
-        <w:rPr>
-          <w:rFonts w:ascii="Arial" w:hAnsi="Arial" w:cs="Arial"/>
-        </w:rPr>
-      </w:pPr>
-      <w:r>
-        <w:rPr>
-          <w:rFonts w:ascii="Arial" w:hAnsi="Arial" w:cs="Arial"/>
+          <w:b/>
+          <w:bCs/>
+        </w:rPr>
+      </w:pPr>
+      <w:r>
+        <w:rPr>
+          <w:rFonts w:ascii="Arial" w:hAnsi="Arial" w:cs="Arial"/>
+          <w:b/>
+          <w:bCs/>
+        </w:rPr>
+        <w:t>1.1 Retrieve your VM Public IP Address [2 marks]</w:t>
+      </w:r>
+    </w:p>
+    <w:p>
+      <w:pPr>
+        <w:rPr>
+          <w:rFonts w:ascii="Arial" w:hAnsi="Arial" w:cs="Arial"/>
+        </w:rPr>
+      </w:pPr>
+    </w:p>
+    <w:p>
+      <w:pPr>
+        <w:rPr>
+          <w:rFonts w:ascii="Arial" w:hAnsi="Arial" w:cs="Arial"/>
+        </w:rPr>
+      </w:pPr>
+      <w:r>
+        <w:rPr>
+          <w:rFonts w:ascii="Arial" w:hAnsi="Arial" w:cs="Arial"/>
+          <w:noProof/>
         </w:rPr>
         <w:drawing>
           <wp:inline distT="0" distB="0" distL="0" distR="0" wp14:anchorId="10B2B4A9" wp14:editId="151D2F1D">
@@ -89,11 +142,6 @@
       </w:r>
     </w:p>
     <w:p>
-      <w:pPr>
-        <w:rPr>
-          <w:rFonts w:ascii="Arial" w:hAnsi="Arial" w:cs="Arial"/>
-        </w:rPr>
-      </w:pPr>
       <w:r>
         <w:rPr>
           <w:rFonts w:ascii="Arial" w:hAnsi="Arial" w:cs="Arial"/>
@@ -116,42 +164,56 @@
           <w:rFonts w:ascii="Arial" w:hAnsi="Arial" w:cs="Arial"/>
         </w:rPr>
       </w:pPr>
-    </w:p>
-    <w:p>
-      <w:pPr>
-        <w:rPr>
-          <w:rFonts w:ascii="Arial" w:hAnsi="Arial" w:cs="Arial"/>
-        </w:rPr>
-      </w:pPr>
-      <w:r>
-        <w:rPr>
-          <w:rFonts w:ascii="Arial" w:hAnsi="Arial" w:cs="Arial"/>
-        </w:rPr>
-        <w:t xml:space="preserve">1.2: </w:t>
-      </w:r>
-      <w:r>
-        <w:rPr>
-          <w:rFonts w:ascii="Arial" w:hAnsi="Arial" w:cs="Arial"/>
-        </w:rPr>
-        <w:t>Connect using PuTTY [5 marks]</w:t>
-      </w:r>
-    </w:p>
-    <w:p>
-      <w:pPr>
-        <w:rPr>
-          <w:rFonts w:ascii="Arial" w:hAnsi="Arial" w:cs="Arial"/>
-        </w:rPr>
-      </w:pPr>
-    </w:p>
-    <w:p>
-      <w:pPr>
-        <w:rPr>
-          <w:rFonts w:ascii="Arial" w:hAnsi="Arial" w:cs="Arial"/>
-        </w:rPr>
-      </w:pPr>
-      <w:r>
-        <w:rPr>
-          <w:rFonts w:ascii="Arial" w:hAnsi="Arial" w:cs="Arial"/>
+      <w:r>
+        <w:rPr>
+          <w:rFonts w:ascii="Arial" w:hAnsi="Arial" w:cs="Arial"/>
+        </w:rPr>
+        <w:t>This screenshot shows the Azure portal displaying the Virtual Machine overview, where the public IP address (20.58.160.121) is visible. This confirms successful access to the assigned VM required for remote connection.</w:t>
+      </w:r>
+    </w:p>
+    <w:p>
+      <w:pPr>
+        <w:rPr>
+          <w:rFonts w:ascii="Arial" w:hAnsi="Arial" w:cs="Arial"/>
+          <w:b/>
+          <w:bCs/>
+        </w:rPr>
+      </w:pPr>
+    </w:p>
+    <w:p>
+      <w:pPr>
+        <w:rPr>
+          <w:rFonts w:ascii="Arial" w:hAnsi="Arial" w:cs="Arial"/>
+          <w:b/>
+          <w:bCs/>
+        </w:rPr>
+      </w:pPr>
+      <w:r>
+        <w:rPr>
+          <w:rFonts w:ascii="Arial" w:hAnsi="Arial" w:cs="Arial"/>
+          <w:b/>
+          <w:bCs/>
+        </w:rPr>
+        <w:t>1.2: Connect using PuTTY [5 marks]</w:t>
+      </w:r>
+    </w:p>
+    <w:p>
+      <w:pPr>
+        <w:rPr>
+          <w:rFonts w:ascii="Arial" w:hAnsi="Arial" w:cs="Arial"/>
+        </w:rPr>
+      </w:pPr>
+    </w:p>
+    <w:p>
+      <w:pPr>
+        <w:rPr>
+          <w:rFonts w:ascii="Arial" w:hAnsi="Arial" w:cs="Arial"/>
+        </w:rPr>
+      </w:pPr>
+      <w:r>
+        <w:rPr>
+          <w:rFonts w:ascii="Arial" w:hAnsi="Arial" w:cs="Arial"/>
+          <w:noProof/>
         </w:rPr>
         <w:lastRenderedPageBreak/>
         <w:drawing>
@@ -197,16 +259,23 @@
           <w:rFonts w:ascii="Arial" w:hAnsi="Arial" w:cs="Arial"/>
         </w:rPr>
       </w:pPr>
-    </w:p>
-    <w:p>
-      <w:pPr>
-        <w:rPr>
-          <w:rFonts w:ascii="Arial" w:hAnsi="Arial" w:cs="Arial"/>
-        </w:rPr>
-      </w:pPr>
-      <w:r>
-        <w:rPr>
-          <w:rFonts w:ascii="Arial" w:hAnsi="Arial" w:cs="Arial"/>
+      <w:r>
+        <w:rPr>
+          <w:rFonts w:ascii="Arial" w:hAnsi="Arial" w:cs="Arial"/>
+        </w:rPr>
+        <w:t>This screenshot shows the PuTTY SSH client configured with the VM’s public IP address and successfully establishing a connection on port 22. This confirms that the VM is accessible remotely via SSH.</w:t>
+      </w:r>
+    </w:p>
+    <w:p>
+      <w:pPr>
+        <w:rPr>
+          <w:rFonts w:ascii="Arial" w:hAnsi="Arial" w:cs="Arial"/>
+        </w:rPr>
+      </w:pPr>
+      <w:r>
+        <w:rPr>
+          <w:rFonts w:ascii="Arial" w:hAnsi="Arial" w:cs="Arial"/>
+          <w:noProof/>
         </w:rPr>
         <w:lastRenderedPageBreak/>
         <w:drawing>
@@ -252,93 +321,34 @@
           <w:rFonts w:ascii="Arial" w:hAnsi="Arial" w:cs="Arial"/>
         </w:rPr>
       </w:pPr>
-    </w:p>
-    <w:p>
-      <w:pPr>
-        <w:rPr>
-          <w:rFonts w:ascii="Arial" w:hAnsi="Arial" w:cs="Arial"/>
-        </w:rPr>
-      </w:pPr>
-      <w:r>
-        <w:rPr>
-          <w:rFonts w:ascii="Arial" w:hAnsi="Arial" w:cs="Arial"/>
-        </w:rPr>
-        <w:drawing>
-          <wp:inline distT="0" distB="0" distL="0" distR="0" wp14:anchorId="11773C59" wp14:editId="71542AEA">
-            <wp:extent cx="5731510" cy="3723640"/>
-            <wp:effectExtent l="0" t="0" r="2540" b="0"/>
-            <wp:docPr id="727220730" name="Picture 1"/>
-            <wp:cNvGraphicFramePr>
-              <a:graphicFrameLocks xmlns:a="http://schemas.openxmlformats.org/drawingml/2006/main" noChangeAspect="1"/>
-            </wp:cNvGraphicFramePr>
-            <a:graphic xmlns:a="http://schemas.openxmlformats.org/drawingml/2006/main">
-              <a:graphicData uri="http://schemas.openxmlformats.org/drawingml/2006/picture">
-                <pic:pic xmlns:pic="http://schemas.openxmlformats.org/drawingml/2006/picture">
-                  <pic:nvPicPr>
-                    <pic:cNvPr id="727220730" name=""/>
-                    <pic:cNvPicPr/>
-                  </pic:nvPicPr>
-                  <pic:blipFill>
-                    <a:blip r:embed="rId11"/>
-                    <a:stretch>
-                      <a:fillRect/>
-                    </a:stretch>
-                  </pic:blipFill>
-                  <pic:spPr>
-                    <a:xfrm>
-                      <a:off x="0" y="0"/>
-                      <a:ext cx="5731510" cy="3723640"/>
-                    </a:xfrm>
-                    <a:prstGeom prst="rect">
-                      <a:avLst/>
-                    </a:prstGeom>
-                  </pic:spPr>
-                </pic:pic>
-              </a:graphicData>
-            </a:graphic>
-          </wp:inline>
-        </w:drawing>
-      </w:r>
-    </w:p>
-    <w:p>
-      <w:pPr>
-        <w:rPr>
-          <w:rFonts w:ascii="Arial" w:hAnsi="Arial" w:cs="Arial"/>
-        </w:rPr>
-      </w:pPr>
-    </w:p>
-    <w:p>
-      <w:pPr>
-        <w:rPr>
-          <w:rFonts w:ascii="Arial" w:hAnsi="Arial" w:cs="Arial"/>
-        </w:rPr>
-      </w:pPr>
-    </w:p>
-    <w:p>
-      <w:pPr>
-        <w:rPr>
-          <w:rFonts w:ascii="Arial" w:hAnsi="Arial" w:cs="Arial"/>
-        </w:rPr>
-      </w:pPr>
-    </w:p>
-    <w:p>
-      <w:pPr>
-        <w:rPr>
-          <w:rFonts w:ascii="Arial" w:hAnsi="Arial" w:cs="Arial"/>
-        </w:rPr>
-      </w:pPr>
-    </w:p>
-    <w:p>
-      <w:pPr>
-        <w:rPr>
-          <w:rFonts w:ascii="Arial" w:hAnsi="Arial" w:cs="Arial"/>
-        </w:rPr>
-      </w:pPr>
-      <w:r>
-        <w:rPr>
-          <w:rFonts w:ascii="Arial" w:hAnsi="Arial" w:cs="Arial"/>
-        </w:rPr>
-        <w:lastRenderedPageBreak/>
+      <w:r>
+        <w:rPr>
+          <w:rFonts w:ascii="Arial" w:hAnsi="Arial" w:cs="Arial"/>
+        </w:rPr>
+        <w:t>This screenshot shows a successful login to the Linux VM through PuTTY, confirming that the provided credentials were accepted and access to the system was established.</w:t>
+      </w:r>
+    </w:p>
+    <w:p>
+      <w:pPr>
+        <w:rPr>
+          <w:rFonts w:ascii="Arial" w:hAnsi="Arial" w:cs="Arial"/>
+        </w:rPr>
+      </w:pPr>
+    </w:p>
+    <w:p>
+      <w:pPr>
+        <w:rPr>
+          <w:rFonts w:ascii="Arial" w:hAnsi="Arial" w:cs="Arial"/>
+          <w:b/>
+          <w:bCs/>
+        </w:rPr>
+      </w:pPr>
+      <w:r>
+        <w:rPr>
+          <w:rFonts w:ascii="Arial" w:hAnsi="Arial" w:cs="Arial"/>
+          <w:b/>
+          <w:bCs/>
+        </w:rPr>
         <w:t>1.3: Change the account username</w:t>
       </w:r>
     </w:p>
@@ -358,6 +368,7 @@
       <w:r>
         <w:rPr>
           <w:rFonts w:ascii="Arial" w:hAnsi="Arial" w:cs="Arial"/>
+          <w:noProof/>
         </w:rPr>
         <w:drawing>
           <wp:inline distT="0" distB="0" distL="0" distR="0" wp14:anchorId="51152B8C" wp14:editId="445C5270">
@@ -375,7 +386,7 @@
                     <pic:cNvPicPr/>
                   </pic:nvPicPr>
                   <pic:blipFill>
-                    <a:blip r:embed="rId12"/>
+                    <a:blip r:embed="rId11"/>
                     <a:stretch>
                       <a:fillRect/>
                     </a:stretch>
@@ -406,6 +417,24 @@
         <w:rPr>
           <w:rFonts w:ascii="Arial" w:hAnsi="Arial" w:cs="Arial"/>
         </w:rPr>
+        <w:t>This screenshot shows the output of the id and ls -la /home/ commands, confirming that the user has been successfully renamed and that the home directory reflects the updated username.</w:t>
+      </w:r>
+    </w:p>
+    <w:p>
+      <w:pPr>
+        <w:rPr>
+          <w:rFonts w:ascii="Arial" w:hAnsi="Arial" w:cs="Arial"/>
+          <w:b/>
+          <w:bCs/>
+        </w:rPr>
+      </w:pPr>
+      <w:r>
+        <w:rPr>
+          <w:rFonts w:ascii="Arial" w:hAnsi="Arial" w:cs="Arial"/>
+          <w:b/>
+          <w:bCs/>
+        </w:rPr>
+        <w:lastRenderedPageBreak/>
         <w:t>Task 1.4: Change the password</w:t>
       </w:r>
     </w:p>
@@ -425,6 +454,7 @@
       <w:r>
         <w:rPr>
           <w:rFonts w:ascii="Arial" w:hAnsi="Arial" w:cs="Arial"/>
+          <w:noProof/>
         </w:rPr>
         <w:drawing>
           <wp:inline distT="0" distB="0" distL="0" distR="0" wp14:anchorId="151AE25D" wp14:editId="55651CAD">
@@ -442,7 +472,7 @@
                     <pic:cNvPicPr/>
                   </pic:nvPicPr>
                   <pic:blipFill>
-                    <a:blip r:embed="rId13"/>
+                    <a:blip r:embed="rId12"/>
                     <a:stretch>
                       <a:fillRect/>
                     </a:stretch>
@@ -467,55 +497,88 @@
       <w:pPr>
         <w:rPr>
           <w:rFonts w:ascii="Arial" w:hAnsi="Arial" w:cs="Arial"/>
-        </w:rPr>
-      </w:pPr>
-    </w:p>
-    <w:p>
-      <w:pPr>
-        <w:rPr>
-          <w:rFonts w:ascii="Arial" w:hAnsi="Arial" w:cs="Arial"/>
-        </w:rPr>
-      </w:pPr>
-    </w:p>
-    <w:p>
-      <w:pPr>
-        <w:rPr>
-          <w:rFonts w:ascii="Arial" w:hAnsi="Arial" w:cs="Arial"/>
-        </w:rPr>
-      </w:pPr>
-    </w:p>
-    <w:p>
-      <w:pPr>
-        <w:rPr>
-          <w:rFonts w:ascii="Arial" w:hAnsi="Arial" w:cs="Arial"/>
-        </w:rPr>
-      </w:pPr>
-    </w:p>
-    <w:p>
-      <w:pPr>
-        <w:rPr>
-          <w:rFonts w:ascii="Arial" w:hAnsi="Arial" w:cs="Arial"/>
-        </w:rPr>
-      </w:pPr>
-    </w:p>
-    <w:p>
-      <w:pPr>
-        <w:rPr>
-          <w:rFonts w:ascii="Arial" w:hAnsi="Arial" w:cs="Arial"/>
-        </w:rPr>
-      </w:pPr>
-    </w:p>
-    <w:p>
-      <w:pPr>
-        <w:rPr>
-          <w:rFonts w:ascii="Arial" w:hAnsi="Arial" w:cs="Arial"/>
-        </w:rPr>
-      </w:pPr>
-      <w:r>
-        <w:rPr>
-          <w:rFonts w:ascii="Arial" w:hAnsi="Arial" w:cs="Arial"/>
-        </w:rPr>
-        <w:lastRenderedPageBreak/>
+          <w:lang w:val="en-AU"/>
+        </w:rPr>
+      </w:pPr>
+      <w:r>
+        <w:rPr>
+          <w:rFonts w:ascii="Arial" w:hAnsi="Arial" w:cs="Arial"/>
+          <w:lang w:val="en-AU"/>
+        </w:rPr>
+        <w:t>This screenshot shows the execution of the passwd command used to update the user’s password. The system confirms that the password has been successfully changed without displaying the actual password for security reasons.</w:t>
+      </w:r>
+    </w:p>
+    <w:p>
+      <w:pPr>
+        <w:rPr>
+          <w:rFonts w:ascii="Arial" w:hAnsi="Arial" w:cs="Arial"/>
+        </w:rPr>
+      </w:pPr>
+    </w:p>
+    <w:p>
+      <w:pPr>
+        <w:rPr>
+          <w:rFonts w:ascii="Arial" w:hAnsi="Arial" w:cs="Arial"/>
+        </w:rPr>
+      </w:pPr>
+    </w:p>
+    <w:p>
+      <w:pPr>
+        <w:rPr>
+          <w:rFonts w:ascii="Arial" w:hAnsi="Arial" w:cs="Arial"/>
+        </w:rPr>
+      </w:pPr>
+    </w:p>
+    <w:p>
+      <w:pPr>
+        <w:rPr>
+          <w:rFonts w:ascii="Arial" w:hAnsi="Arial" w:cs="Arial"/>
+        </w:rPr>
+      </w:pPr>
+    </w:p>
+    <w:p>
+      <w:pPr>
+        <w:rPr>
+          <w:rFonts w:ascii="Arial" w:hAnsi="Arial" w:cs="Arial"/>
+        </w:rPr>
+      </w:pPr>
+    </w:p>
+    <w:p>
+      <w:pPr>
+        <w:rPr>
+          <w:rFonts w:ascii="Arial" w:hAnsi="Arial" w:cs="Arial"/>
+          <w:b/>
+          <w:bCs/>
+        </w:rPr>
+      </w:pPr>
+      <w:r>
+        <w:rPr>
+          <w:rFonts w:ascii="Arial" w:hAnsi="Arial" w:cs="Arial"/>
+          <w:b/>
+          <w:bCs/>
+        </w:rPr>
+        <w:t xml:space="preserve">Installation of git </w:t>
+      </w:r>
+    </w:p>
+    <w:p>
+      <w:pPr>
+        <w:rPr>
+          <w:rFonts w:ascii="Arial" w:hAnsi="Arial" w:cs="Arial"/>
+          <w:noProof/>
+        </w:rPr>
+      </w:pPr>
+    </w:p>
+    <w:p>
+      <w:pPr>
+        <w:rPr>
+          <w:rFonts w:ascii="Arial" w:hAnsi="Arial" w:cs="Arial"/>
+        </w:rPr>
+      </w:pPr>
+      <w:r>
+        <w:rPr>
+          <w:rFonts w:ascii="Arial" w:hAnsi="Arial" w:cs="Arial"/>
+          <w:noProof/>
+        </w:rPr>
         <w:drawing>
           <wp:inline distT="0" distB="0" distL="0" distR="0" wp14:anchorId="02FD88ED" wp14:editId="120AD74F">
             <wp:extent cx="5731510" cy="3288665"/>
@@ -532,7 +595,7 @@
                     <pic:cNvPicPr/>
                   </pic:nvPicPr>
                   <pic:blipFill>
-                    <a:blip r:embed="rId14"/>
+                    <a:blip r:embed="rId13"/>
                     <a:stretch>
                       <a:fillRect/>
                     </a:stretch>
@@ -559,9 +622,63 @@
           <w:rFonts w:ascii="Arial" w:hAnsi="Arial" w:cs="Arial"/>
         </w:rPr>
       </w:pPr>
-      <w:r>
-        <w:rPr>
-          <w:rFonts w:ascii="Arial" w:hAnsi="Arial" w:cs="Arial"/>
+    </w:p>
+    <w:p>
+      <w:pPr>
+        <w:rPr>
+          <w:rFonts w:ascii="Arial" w:hAnsi="Arial" w:cs="Arial"/>
+        </w:rPr>
+      </w:pPr>
+    </w:p>
+    <w:p>
+      <w:pPr>
+        <w:rPr>
+          <w:rFonts w:ascii="Arial" w:hAnsi="Arial" w:cs="Arial"/>
+        </w:rPr>
+      </w:pPr>
+    </w:p>
+    <w:p>
+      <w:pPr>
+        <w:rPr>
+          <w:rFonts w:ascii="Arial" w:hAnsi="Arial" w:cs="Arial"/>
+        </w:rPr>
+      </w:pPr>
+    </w:p>
+    <w:p>
+      <w:pPr>
+        <w:rPr>
+          <w:rFonts w:ascii="Arial" w:hAnsi="Arial" w:cs="Arial"/>
+        </w:rPr>
+      </w:pPr>
+    </w:p>
+    <w:p>
+      <w:pPr>
+        <w:rPr>
+          <w:rFonts w:ascii="Arial" w:hAnsi="Arial" w:cs="Arial"/>
+          <w:b/>
+          <w:bCs/>
+        </w:rPr>
+      </w:pPr>
+      <w:r>
+        <w:rPr>
+          <w:rFonts w:ascii="Arial" w:hAnsi="Arial" w:cs="Arial"/>
+          <w:b/>
+          <w:bCs/>
+        </w:rPr>
+        <w:lastRenderedPageBreak/>
+        <w:t>Successful cloning of the repo</w:t>
+      </w:r>
+    </w:p>
+    <w:p>
+      <w:pPr>
+        <w:rPr>
+          <w:rFonts w:ascii="Arial" w:hAnsi="Arial" w:cs="Arial"/>
+        </w:rPr>
+      </w:pPr>
+      <w:r>
+        <w:rPr>
+          <w:rFonts w:ascii="Arial" w:hAnsi="Arial" w:cs="Arial"/>
+          <w:noProof/>
         </w:rPr>
         <w:drawing>
           <wp:inline distT="0" distB="0" distL="0" distR="0" wp14:anchorId="56ECFF4F" wp14:editId="5840EBB2">
@@ -579,7 +696,7 @@
                     <pic:cNvPicPr/>
                   </pic:nvPicPr>
                   <pic:blipFill>
-                    <a:blip r:embed="rId15"/>
+                    <a:blip r:embed="rId14"/>
                     <a:stretch>
                       <a:fillRect/>
                     </a:stretch>
@@ -688,13 +805,16 @@
       <w:pPr>
         <w:rPr>
           <w:rFonts w:ascii="Arial" w:hAnsi="Arial" w:cs="Arial"/>
-        </w:rPr>
-      </w:pPr>
-      <w:r>
-        <w:rPr>
-          <w:rFonts w:ascii="Arial" w:hAnsi="Arial" w:cs="Arial"/>
-        </w:rPr>
-        <w:lastRenderedPageBreak/>
+          <w:b/>
+          <w:bCs/>
+        </w:rPr>
+      </w:pPr>
+      <w:r>
+        <w:rPr>
+          <w:rFonts w:ascii="Arial" w:hAnsi="Arial" w:cs="Arial"/>
+          <w:b/>
+          <w:bCs/>
+        </w:rPr>
         <w:t xml:space="preserve">Task 2: Requirement 1: Read and parse users.csv </w:t>
       </w:r>
     </w:p>
@@ -707,6 +827,7 @@
       <w:r>
         <w:rPr>
           <w:rFonts w:ascii="Arial" w:hAnsi="Arial" w:cs="Arial"/>
+          <w:noProof/>
         </w:rPr>
         <w:drawing>
           <wp:inline distT="0" distB="0" distL="0" distR="0" wp14:anchorId="26644A61" wp14:editId="20B2D6EE">
@@ -724,7 +845,7 @@
                     <pic:cNvPicPr/>
                   </pic:nvPicPr>
                   <pic:blipFill>
-                    <a:blip r:embed="rId16"/>
+                    <a:blip r:embed="rId15"/>
                     <a:stretch>
                       <a:fillRect/>
                     </a:stretch>
@@ -755,7 +876,8 @@
         <w:rPr>
           <w:rFonts w:ascii="Arial" w:hAnsi="Arial" w:cs="Arial"/>
         </w:rPr>
-        <w:t>Screenshot: running the script (</w:t>
+        <w:lastRenderedPageBreak/>
+        <w:t xml:space="preserve">This screenshot shows the execution of the onboard_users.sh script using </w:t>
       </w:r>
       <w:proofErr w:type="spellStart"/>
       <w:r>
@@ -769,187 +891,60 @@
         <w:rPr>
           <w:rFonts w:ascii="Arial" w:hAnsi="Arial" w:cs="Arial"/>
         </w:rPr>
-        <w:t xml:space="preserve"> bash onboard_users.sh) showing output</w:t>
-      </w:r>
-    </w:p>
-    <w:p>
-      <w:pPr>
-        <w:rPr>
-          <w:rFonts w:ascii="Arial" w:hAnsi="Arial" w:cs="Arial"/>
-        </w:rPr>
-      </w:pPr>
-      <w:r>
-        <w:rPr>
-          <w:rFonts w:ascii="Arial" w:hAnsi="Arial" w:cs="Arial"/>
-        </w:rPr>
-        <w:t>for multiple users</w:t>
-      </w:r>
-    </w:p>
-    <w:p>
-      <w:pPr>
-        <w:rPr>
-          <w:rFonts w:ascii="Arial" w:hAnsi="Arial" w:cs="Arial"/>
-        </w:rPr>
-      </w:pPr>
-      <w:r>
-        <w:rPr>
-          <w:rFonts w:ascii="Arial" w:hAnsi="Arial" w:cs="Arial"/>
-        </w:rPr>
-        <w:lastRenderedPageBreak/>
-        <w:drawing>
-          <wp:inline distT="0" distB="0" distL="0" distR="0" wp14:anchorId="751CC741" wp14:editId="6B4FE805">
-            <wp:extent cx="5731510" cy="7974965"/>
-            <wp:effectExtent l="0" t="0" r="2540" b="6985"/>
-            <wp:docPr id="1418843325" name="Picture 1"/>
-            <wp:cNvGraphicFramePr>
-              <a:graphicFrameLocks xmlns:a="http://schemas.openxmlformats.org/drawingml/2006/main" noChangeAspect="1"/>
-            </wp:cNvGraphicFramePr>
-            <a:graphic xmlns:a="http://schemas.openxmlformats.org/drawingml/2006/main">
-              <a:graphicData uri="http://schemas.openxmlformats.org/drawingml/2006/picture">
-                <pic:pic xmlns:pic="http://schemas.openxmlformats.org/drawingml/2006/picture">
-                  <pic:nvPicPr>
-                    <pic:cNvPr id="1418843325" name=""/>
-                    <pic:cNvPicPr/>
-                  </pic:nvPicPr>
-                  <pic:blipFill>
-                    <a:blip r:embed="rId17"/>
-                    <a:stretch>
-                      <a:fillRect/>
-                    </a:stretch>
-                  </pic:blipFill>
-                  <pic:spPr>
-                    <a:xfrm>
-                      <a:off x="0" y="0"/>
-                      <a:ext cx="5731510" cy="7974965"/>
-                    </a:xfrm>
-                    <a:prstGeom prst="rect">
-                      <a:avLst/>
-                    </a:prstGeom>
-                  </pic:spPr>
-                </pic:pic>
-              </a:graphicData>
-            </a:graphic>
-          </wp:inline>
-        </w:drawing>
-      </w:r>
-    </w:p>
-    <w:p>
-      <w:pPr>
-        <w:rPr>
-          <w:rFonts w:ascii="Arial" w:hAnsi="Arial" w:cs="Arial"/>
-        </w:rPr>
-      </w:pPr>
-      <w:r>
-        <w:rPr>
-          <w:rFonts w:ascii="Arial" w:hAnsi="Arial" w:cs="Arial"/>
-        </w:rPr>
-        <w:lastRenderedPageBreak/>
-        <w:drawing>
-          <wp:inline distT="0" distB="0" distL="0" distR="0" wp14:anchorId="0C591FDB" wp14:editId="750A0532">
-            <wp:extent cx="5731510" cy="5264785"/>
-            <wp:effectExtent l="0" t="0" r="2540" b="0"/>
-            <wp:docPr id="372629381" name="Picture 1"/>
-            <wp:cNvGraphicFramePr>
-              <a:graphicFrameLocks xmlns:a="http://schemas.openxmlformats.org/drawingml/2006/main" noChangeAspect="1"/>
-            </wp:cNvGraphicFramePr>
-            <a:graphic xmlns:a="http://schemas.openxmlformats.org/drawingml/2006/main">
-              <a:graphicData uri="http://schemas.openxmlformats.org/drawingml/2006/picture">
-                <pic:pic xmlns:pic="http://schemas.openxmlformats.org/drawingml/2006/picture">
-                  <pic:nvPicPr>
-                    <pic:cNvPr id="372629381" name=""/>
-                    <pic:cNvPicPr/>
-                  </pic:nvPicPr>
-                  <pic:blipFill>
-                    <a:blip r:embed="rId18"/>
-                    <a:stretch>
-                      <a:fillRect/>
-                    </a:stretch>
-                  </pic:blipFill>
-                  <pic:spPr>
-                    <a:xfrm>
-                      <a:off x="0" y="0"/>
-                      <a:ext cx="5731510" cy="5264785"/>
-                    </a:xfrm>
-                    <a:prstGeom prst="rect">
-                      <a:avLst/>
-                    </a:prstGeom>
-                  </pic:spPr>
-                </pic:pic>
-              </a:graphicData>
-            </a:graphic>
-          </wp:inline>
-        </w:drawing>
-      </w:r>
-    </w:p>
-    <w:p>
-      <w:pPr>
-        <w:rPr>
-          <w:rFonts w:ascii="Arial" w:hAnsi="Arial" w:cs="Arial"/>
-          <w:i/>
-          <w:iCs/>
-        </w:rPr>
-      </w:pPr>
-      <w:r>
-        <w:rPr>
-          <w:rFonts w:ascii="Arial" w:hAnsi="Arial" w:cs="Arial"/>
-          <w:i/>
-          <w:iCs/>
-        </w:rPr>
-        <w:t xml:space="preserve">Cap: </w:t>
-      </w:r>
-      <w:r>
-        <w:rPr>
-          <w:rFonts w:ascii="Arial" w:hAnsi="Arial" w:cs="Arial"/>
-          <w:i/>
-          <w:iCs/>
-        </w:rPr>
-        <w:t>onboard_users.sh — the complete script with inline comments</w:t>
-      </w:r>
-    </w:p>
-    <w:p>
-      <w:pPr>
-        <w:rPr>
-          <w:rFonts w:ascii="Arial" w:hAnsi="Arial" w:cs="Arial"/>
-        </w:rPr>
-      </w:pPr>
-    </w:p>
-    <w:p>
-      <w:pPr>
-        <w:rPr>
-          <w:rFonts w:ascii="Arial" w:hAnsi="Arial" w:cs="Arial"/>
-        </w:rPr>
-      </w:pPr>
-      <w:r>
-        <w:rPr>
-          <w:rFonts w:ascii="Arial" w:hAnsi="Arial" w:cs="Arial"/>
-        </w:rPr>
-        <w:t>Screenshot: contents of /var/log/user_onboarding_audit.log showing timestamped</w:t>
-      </w:r>
-    </w:p>
-    <w:p>
-      <w:pPr>
-        <w:rPr>
-          <w:rFonts w:ascii="Arial" w:hAnsi="Arial" w:cs="Arial"/>
-        </w:rPr>
-      </w:pPr>
-      <w:r>
-        <w:rPr>
-          <w:rFonts w:ascii="Arial" w:hAnsi="Arial" w:cs="Arial"/>
-        </w:rPr>
-        <w:t>entries</w:t>
-      </w:r>
-    </w:p>
-    <w:p>
-      <w:pPr>
-        <w:rPr>
-          <w:rFonts w:ascii="Arial" w:hAnsi="Arial" w:cs="Arial"/>
-        </w:rPr>
-      </w:pPr>
-      <w:r>
-        <w:rPr>
-          <w:rFonts w:ascii="Arial" w:hAnsi="Arial" w:cs="Arial"/>
-        </w:rPr>
-        <w:lastRenderedPageBreak/>
+        <w:t xml:space="preserve"> privileges. The output confirms that multiple users from the CSV file are being processed, demonstrating successful automation of user onboarding.</w:t>
+      </w:r>
+    </w:p>
+    <w:p>
+      <w:pPr>
+        <w:rPr>
+          <w:rFonts w:ascii="Arial" w:hAnsi="Arial" w:cs="Arial"/>
+        </w:rPr>
+      </w:pPr>
+    </w:p>
+    <w:p>
+      <w:pPr>
+        <w:rPr>
+          <w:rFonts w:ascii="Arial" w:hAnsi="Arial" w:cs="Arial"/>
+          <w:b/>
+          <w:bCs/>
+        </w:rPr>
+      </w:pPr>
+    </w:p>
+    <w:p>
+      <w:pPr>
+        <w:rPr>
+          <w:rFonts w:ascii="Arial" w:hAnsi="Arial" w:cs="Arial"/>
+          <w:b/>
+          <w:bCs/>
+        </w:rPr>
+      </w:pPr>
+      <w:r>
+        <w:rPr>
+          <w:rFonts w:ascii="Arial" w:hAnsi="Arial" w:cs="Arial"/>
+          <w:b/>
+          <w:bCs/>
+        </w:rPr>
+        <w:t>Audit Log Output Showing User Onboarding Actions and Error Handling</w:t>
+      </w:r>
+    </w:p>
+    <w:p>
+      <w:pPr>
+        <w:rPr>
+          <w:rFonts w:ascii="Arial" w:hAnsi="Arial" w:cs="Arial"/>
+        </w:rPr>
+      </w:pPr>
+    </w:p>
+    <w:p>
+      <w:pPr>
+        <w:rPr>
+          <w:rFonts w:ascii="Arial" w:hAnsi="Arial" w:cs="Arial"/>
+        </w:rPr>
+      </w:pPr>
+      <w:r>
+        <w:rPr>
+          <w:rFonts w:ascii="Arial" w:hAnsi="Arial" w:cs="Arial"/>
+          <w:noProof/>
+        </w:rPr>
         <w:drawing>
           <wp:inline distT="0" distB="0" distL="0" distR="0" wp14:anchorId="66939A1E" wp14:editId="79171A36">
             <wp:extent cx="5731510" cy="3731260"/>
@@ -966,7 +961,7 @@
                     <pic:cNvPicPr/>
                   </pic:nvPicPr>
                   <pic:blipFill>
-                    <a:blip r:embed="rId19"/>
+                    <a:blip r:embed="rId16"/>
                     <a:stretch>
                       <a:fillRect/>
                     </a:stretch>
@@ -993,6 +988,7 @@
           <w:rFonts w:ascii="Arial" w:hAnsi="Arial" w:cs="Arial"/>
           <w:i/>
           <w:iCs/>
+          <w:lang w:val="en-AU"/>
         </w:rPr>
       </w:pPr>
       <w:r>
@@ -1000,29 +996,52 @@
           <w:rFonts w:ascii="Arial" w:hAnsi="Arial" w:cs="Arial"/>
           <w:i/>
           <w:iCs/>
-        </w:rPr>
-        <w:t xml:space="preserve">Cap: </w:t>
-      </w:r>
-      <w:r>
-        <w:rPr>
-          <w:rFonts w:ascii="Arial" w:hAnsi="Arial" w:cs="Arial"/>
-          <w:i/>
-          <w:iCs/>
-        </w:rPr>
-        <w:t>Audit log showing timestamped entries of user creation, updates, and group management actions.</w:t>
-      </w:r>
-    </w:p>
-    <w:p>
-      <w:pPr>
-        <w:rPr>
-          <w:rFonts w:ascii="Arial" w:hAnsi="Arial" w:cs="Arial"/>
-        </w:rPr>
-      </w:pPr>
-      <w:r>
-        <w:rPr>
-          <w:rFonts w:ascii="Arial" w:hAnsi="Arial" w:cs="Arial"/>
-        </w:rPr>
-        <w:t>Screenshot: id &lt;username&gt; and ls -la /home/ /opt/projects/ confirming</w:t>
+          <w:lang w:val="en-AU"/>
+        </w:rPr>
+        <w:t>This screenshot displays the contents of /var/log/user_onboarding_audit.log, showing timestamped log entries for user creation, updates, and group assignments. This confirms that all actions are recorded as required.</w:t>
+      </w:r>
+    </w:p>
+    <w:p>
+      <w:pPr>
+        <w:rPr>
+          <w:rFonts w:ascii="Arial" w:hAnsi="Arial" w:cs="Arial"/>
+          <w:b/>
+          <w:bCs/>
+        </w:rPr>
+      </w:pPr>
+      <w:r>
+        <w:rPr>
+          <w:rFonts w:ascii="Arial" w:hAnsi="Arial" w:cs="Arial"/>
+          <w:b/>
+          <w:bCs/>
+        </w:rPr>
+        <w:t>Screenshot: id &lt;username&gt; and ls -</w:t>
+      </w:r>
+      <w:proofErr w:type="spellStart"/>
+      <w:r>
+        <w:rPr>
+          <w:rFonts w:ascii="Arial" w:hAnsi="Arial" w:cs="Arial"/>
+          <w:b/>
+          <w:bCs/>
+        </w:rPr>
+        <w:t>l</w:t>
+      </w:r>
+      <w:r>
+        <w:rPr>
+          <w:rFonts w:ascii="Arial" w:hAnsi="Arial" w:cs="Arial"/>
+          <w:b/>
+          <w:bCs/>
+        </w:rPr>
+        <w:t>d</w:t>
+      </w:r>
+      <w:proofErr w:type="spellEnd"/>
+      <w:r>
+        <w:rPr>
+          <w:rFonts w:ascii="Arial" w:hAnsi="Arial" w:cs="Arial"/>
+          <w:b/>
+          <w:bCs/>
+        </w:rPr>
+        <w:t xml:space="preserve"> /home/ /opt/projects/ confirming</w:t>
       </w:r>
     </w:p>
     <w:p>
@@ -1047,6 +1066,7 @@
       <w:r>
         <w:rPr>
           <w:rFonts w:ascii="Arial" w:hAnsi="Arial" w:cs="Arial"/>
+          <w:noProof/>
         </w:rPr>
         <w:drawing>
           <wp:inline distT="0" distB="0" distL="0" distR="0" wp14:anchorId="7D5E011C" wp14:editId="1A5D9585">
@@ -1064,7 +1084,7 @@
                     <pic:cNvPicPr/>
                   </pic:nvPicPr>
                   <pic:blipFill>
-                    <a:blip r:embed="rId20"/>
+                    <a:blip r:embed="rId17"/>
                     <a:stretch>
                       <a:fillRect/>
                     </a:stretch>
@@ -1097,101 +1117,97 @@
           <w:i/>
           <w:iCs/>
         </w:rPr>
-        <w:t xml:space="preserve">Cap: </w:t>
-      </w:r>
+        <w:t>This screenshot shows the output of the id, ls -</w:t>
+      </w:r>
+      <w:proofErr w:type="spellStart"/>
       <w:r>
         <w:rPr>
           <w:rFonts w:ascii="Arial" w:hAnsi="Arial" w:cs="Arial"/>
           <w:i/>
           <w:iCs/>
         </w:rPr>
-        <w:t>Verification of user account and directory setup showing correct ownership and permissions</w:t>
-      </w:r>
-      <w:r>
-        <w:rPr>
-          <w:rFonts w:ascii="Arial" w:hAnsi="Arial" w:cs="Arial"/>
-        </w:rPr>
-        <w:t xml:space="preserve"> for home and project directories.</w:t>
-      </w:r>
-    </w:p>
-    <w:p>
-      <w:pPr>
-        <w:rPr>
-          <w:rFonts w:ascii="Arial" w:hAnsi="Arial" w:cs="Arial"/>
-        </w:rPr>
-      </w:pPr>
-    </w:p>
-    <w:p>
-      <w:pPr>
-        <w:rPr>
-          <w:rFonts w:ascii="Arial" w:hAnsi="Arial" w:cs="Arial"/>
-        </w:rPr>
-      </w:pPr>
-    </w:p>
-    <w:p>
-      <w:pPr>
-        <w:rPr>
-          <w:rFonts w:ascii="Arial" w:hAnsi="Arial" w:cs="Arial"/>
-        </w:rPr>
-      </w:pPr>
-    </w:p>
-    <w:p>
-      <w:pPr>
-        <w:rPr>
-          <w:rFonts w:ascii="Arial" w:hAnsi="Arial" w:cs="Arial"/>
-        </w:rPr>
-      </w:pPr>
-    </w:p>
-    <w:p>
-      <w:pPr>
-        <w:rPr>
-          <w:rFonts w:ascii="Arial" w:hAnsi="Arial" w:cs="Arial"/>
-        </w:rPr>
-      </w:pPr>
-    </w:p>
-    <w:p>
-      <w:pPr>
-        <w:rPr>
-          <w:rFonts w:ascii="Arial" w:hAnsi="Arial" w:cs="Arial"/>
-        </w:rPr>
-      </w:pPr>
-    </w:p>
-    <w:p>
-      <w:pPr>
-        <w:rPr>
-          <w:rFonts w:ascii="Arial" w:hAnsi="Arial" w:cs="Arial"/>
-        </w:rPr>
-      </w:pPr>
-    </w:p>
-    <w:p>
-      <w:pPr>
-        <w:rPr>
-          <w:rFonts w:ascii="Arial" w:hAnsi="Arial" w:cs="Arial"/>
-        </w:rPr>
-      </w:pPr>
-      <w:r>
-        <w:rPr>
-          <w:rFonts w:ascii="Arial" w:hAnsi="Arial" w:cs="Arial"/>
-        </w:rPr>
-        <w:lastRenderedPageBreak/>
-        <w:t>Screenshot: terminal showing the top 10 token output when the script is run</w:t>
-      </w:r>
-      <w:r>
-        <w:rPr>
-          <w:rFonts w:ascii="Arial" w:hAnsi="Arial" w:cs="Arial"/>
-        </w:rPr>
-        <w:t xml:space="preserve">. </w:t>
-      </w:r>
-    </w:p>
-    <w:p>
-      <w:pPr>
-        <w:rPr>
-          <w:rFonts w:ascii="Arial" w:hAnsi="Arial" w:cs="Arial"/>
-        </w:rPr>
-      </w:pPr>
-      <w:r>
-        <w:rPr>
-          <w:rFonts w:ascii="Arial" w:hAnsi="Arial" w:cs="Arial"/>
+        <w:t>l</w:t>
+      </w:r>
+      <w:r>
+        <w:rPr>
+          <w:rFonts w:ascii="Arial" w:hAnsi="Arial" w:cs="Arial"/>
+          <w:i/>
+          <w:iCs/>
+        </w:rPr>
+        <w:t>d</w:t>
+      </w:r>
+      <w:proofErr w:type="spellEnd"/>
+      <w:r>
+        <w:rPr>
+          <w:rFonts w:ascii="Arial" w:hAnsi="Arial" w:cs="Arial"/>
+          <w:i/>
+          <w:iCs/>
+        </w:rPr>
+        <w:t xml:space="preserve"> /home/, and /opt/projects/ commands, confirming that the user account, home directory, and project directory have been created with the correct ownership and permissions.</w:t>
+      </w:r>
+    </w:p>
+    <w:p>
+      <w:pPr>
+        <w:rPr>
+          <w:rFonts w:ascii="Arial" w:hAnsi="Arial" w:cs="Arial"/>
+        </w:rPr>
+      </w:pPr>
+    </w:p>
+    <w:p>
+      <w:pPr>
+        <w:rPr>
+          <w:rFonts w:ascii="Arial" w:hAnsi="Arial" w:cs="Arial"/>
+        </w:rPr>
+      </w:pPr>
+    </w:p>
+    <w:p>
+      <w:pPr>
+        <w:rPr>
+          <w:rFonts w:ascii="Arial" w:hAnsi="Arial" w:cs="Arial"/>
+        </w:rPr>
+      </w:pPr>
+    </w:p>
+    <w:p>
+      <w:pPr>
+        <w:rPr>
+          <w:rFonts w:ascii="Arial" w:hAnsi="Arial" w:cs="Arial"/>
+          <w:b/>
+          <w:bCs/>
+        </w:rPr>
+      </w:pPr>
+      <w:r>
+        <w:rPr>
+          <w:rFonts w:ascii="Arial" w:hAnsi="Arial" w:cs="Arial"/>
+          <w:b/>
+          <w:bCs/>
+        </w:rPr>
+        <w:t>Execution of Critical Log Analysis Script Showing Top 10 Token Frequencies</w:t>
+      </w:r>
+    </w:p>
+    <w:p>
+      <w:pPr>
+        <w:rPr>
+          <w:rFonts w:ascii="Arial" w:hAnsi="Arial" w:cs="Arial"/>
+        </w:rPr>
+      </w:pPr>
+    </w:p>
+    <w:p>
+      <w:pPr>
+        <w:rPr>
+          <w:rFonts w:ascii="Arial" w:hAnsi="Arial" w:cs="Arial"/>
+        </w:rPr>
+      </w:pPr>
+    </w:p>
+    <w:p>
+      <w:pPr>
+        <w:rPr>
+          <w:rFonts w:ascii="Arial" w:hAnsi="Arial" w:cs="Arial"/>
+        </w:rPr>
+      </w:pPr>
+      <w:r>
+        <w:rPr>
+          <w:rFonts w:ascii="Arial" w:hAnsi="Arial" w:cs="Arial"/>
+          <w:noProof/>
         </w:rPr>
         <w:drawing>
           <wp:inline distT="0" distB="0" distL="0" distR="0" wp14:anchorId="68321A24" wp14:editId="7C7ED79F">
@@ -1209,7 +1225,7 @@
                     <pic:cNvPicPr/>
                   </pic:nvPicPr>
                   <pic:blipFill>
-                    <a:blip r:embed="rId21"/>
+                    <a:blip r:embed="rId18"/>
                     <a:stretch>
                       <a:fillRect/>
                     </a:stretch>
@@ -1236,23 +1252,124 @@
           <w:rFonts w:ascii="Arial" w:hAnsi="Arial" w:cs="Arial"/>
         </w:rPr>
       </w:pPr>
-    </w:p>
-    <w:p>
-      <w:pPr>
-        <w:rPr>
-          <w:rFonts w:ascii="Arial" w:hAnsi="Arial" w:cs="Arial"/>
-        </w:rPr>
-      </w:pPr>
-    </w:p>
-    <w:p>
-      <w:pPr>
-        <w:rPr>
-          <w:rFonts w:ascii="Arial" w:hAnsi="Arial" w:cs="Arial"/>
-        </w:rPr>
-      </w:pPr>
-      <w:r>
-        <w:rPr>
-          <w:rFonts w:ascii="Arial" w:hAnsi="Arial" w:cs="Arial"/>
+      <w:r>
+        <w:rPr>
+          <w:rFonts w:ascii="Arial" w:hAnsi="Arial" w:cs="Arial"/>
+        </w:rPr>
+        <w:t>This screenshot shows the output of the critical_log_analysis.sh script, displaying the top 10 most frequent tokens found in critical log entries (ERROR, CRITICAL, FATAL). This confirms successful filtering, tokenization, and frequency analysis.</w:t>
+      </w:r>
+    </w:p>
+    <w:p>
+      <w:pPr>
+        <w:rPr>
+          <w:rFonts w:ascii="Arial" w:hAnsi="Arial" w:cs="Arial"/>
+        </w:rPr>
+      </w:pPr>
+    </w:p>
+    <w:p>
+      <w:pPr>
+        <w:rPr>
+          <w:rFonts w:ascii="Arial" w:hAnsi="Arial" w:cs="Arial"/>
+          <w:b/>
+          <w:bCs/>
+        </w:rPr>
+      </w:pPr>
+      <w:r>
+        <w:rPr>
+          <w:rFonts w:ascii="Arial" w:hAnsi="Arial" w:cs="Arial"/>
+          <w:b/>
+          <w:bCs/>
+        </w:rPr>
+        <w:t>Saved Output File (top10_critical.txt) Showing Top 10 Token Frequencies in GitHub Repository</w:t>
+      </w:r>
+    </w:p>
+    <w:p>
+      <w:pPr>
+        <w:rPr>
+          <w:rFonts w:ascii="Arial" w:hAnsi="Arial" w:cs="Arial"/>
+        </w:rPr>
+      </w:pPr>
+      <w:r>
+        <w:rPr>
+          <w:rFonts w:ascii="Arial" w:hAnsi="Arial" w:cs="Arial"/>
+        </w:rPr>
+        <w:drawing>
+          <wp:inline distT="0" distB="0" distL="0" distR="0" wp14:anchorId="18E8B8A0" wp14:editId="79407C37">
+            <wp:extent cx="5731510" cy="2625725"/>
+            <wp:effectExtent l="0" t="0" r="2540" b="3175"/>
+            <wp:docPr id="756955901" name="Picture 1"/>
+            <wp:cNvGraphicFramePr>
+              <a:graphicFrameLocks xmlns:a="http://schemas.openxmlformats.org/drawingml/2006/main" noChangeAspect="1"/>
+            </wp:cNvGraphicFramePr>
+            <a:graphic xmlns:a="http://schemas.openxmlformats.org/drawingml/2006/main">
+              <a:graphicData uri="http://schemas.openxmlformats.org/drawingml/2006/picture">
+                <pic:pic xmlns:pic="http://schemas.openxmlformats.org/drawingml/2006/picture">
+                  <pic:nvPicPr>
+                    <pic:cNvPr id="756955901" name=""/>
+                    <pic:cNvPicPr/>
+                  </pic:nvPicPr>
+                  <pic:blipFill>
+                    <a:blip r:embed="rId19"/>
+                    <a:stretch>
+                      <a:fillRect/>
+                    </a:stretch>
+                  </pic:blipFill>
+                  <pic:spPr>
+                    <a:xfrm>
+                      <a:off x="0" y="0"/>
+                      <a:ext cx="5731510" cy="2625725"/>
+                    </a:xfrm>
+                    <a:prstGeom prst="rect">
+                      <a:avLst/>
+                    </a:prstGeom>
+                  </pic:spPr>
+                </pic:pic>
+              </a:graphicData>
+            </a:graphic>
+          </wp:inline>
+        </w:drawing>
+      </w:r>
+    </w:p>
+    <w:p>
+      <w:pPr>
+        <w:rPr>
+          <w:rFonts w:ascii="Arial" w:hAnsi="Arial" w:cs="Arial"/>
+        </w:rPr>
+      </w:pPr>
+      <w:r>
+        <w:rPr>
+          <w:rFonts w:ascii="Arial" w:hAnsi="Arial" w:cs="Arial"/>
+        </w:rPr>
+        <w:t xml:space="preserve">This screenshot shows the top10_critical.txt file stored in the GitHub repository, displaying the top 10 most frequent tokens extracted from critical log entries. The output confirms that </w:t>
+      </w:r>
+      <w:r>
+        <w:rPr>
+          <w:rFonts w:ascii="Arial" w:hAnsi="Arial" w:cs="Arial"/>
+        </w:rPr>
+        <w:lastRenderedPageBreak/>
+        <w:t>the script successfully performed filtering, tokenization, frequency counting, and saved the results to a file as required.</w:t>
+      </w:r>
+    </w:p>
+    <w:p>
+      <w:pPr>
+        <w:rPr>
+          <w:rFonts w:ascii="Arial" w:hAnsi="Arial" w:cs="Arial"/>
+        </w:rPr>
+      </w:pPr>
+    </w:p>
+    <w:p>
+      <w:pPr>
+        <w:rPr>
+          <w:rFonts w:ascii="Arial" w:hAnsi="Arial" w:cs="Arial"/>
+          <w:b/>
+          <w:bCs/>
+        </w:rPr>
+      </w:pPr>
+      <w:r>
+        <w:rPr>
+          <w:rFonts w:ascii="Arial" w:hAnsi="Arial" w:cs="Arial"/>
+          <w:b/>
+          <w:bCs/>
         </w:rPr>
         <w:t>File Submission:</w:t>
       </w:r>
@@ -1266,6 +1383,7 @@
       <w:r>
         <w:rPr>
           <w:rFonts w:ascii="Arial" w:hAnsi="Arial" w:cs="Arial"/>
+          <w:noProof/>
         </w:rPr>
         <w:drawing>
           <wp:inline distT="0" distB="0" distL="0" distR="0" wp14:anchorId="1B552774" wp14:editId="0BCDFCA0">
@@ -1283,7 +1401,7 @@
                     <pic:cNvPicPr/>
                   </pic:nvPicPr>
                   <pic:blipFill>
-                    <a:blip r:embed="rId22"/>
+                    <a:blip r:embed="rId20"/>
                     <a:stretch>
                       <a:fillRect/>
                     </a:stretch>
@@ -1313,6 +1431,7 @@
       <w:r>
         <w:rPr>
           <w:rFonts w:ascii="Arial" w:hAnsi="Arial" w:cs="Arial"/>
+          <w:noProof/>
         </w:rPr>
         <w:lastRenderedPageBreak/>
         <w:drawing>
@@ -1331,7 +1450,7 @@
                     <pic:cNvPicPr/>
                   </pic:nvPicPr>
                   <pic:blipFill>
-                    <a:blip r:embed="rId23"/>
+                    <a:blip r:embed="rId21"/>
                     <a:stretch>
                       <a:fillRect/>
                     </a:stretch>
@@ -1356,11 +1475,15 @@
       <w:pPr>
         <w:rPr>
           <w:rFonts w:ascii="Arial" w:hAnsi="Arial" w:cs="Arial"/>
-        </w:rPr>
-      </w:pPr>
-      <w:r>
-        <w:rPr>
-          <w:rFonts w:ascii="Arial" w:hAnsi="Arial" w:cs="Arial"/>
+          <w:b/>
+          <w:bCs/>
+        </w:rPr>
+      </w:pPr>
+      <w:r>
+        <w:rPr>
+          <w:rFonts w:ascii="Arial" w:hAnsi="Arial" w:cs="Arial"/>
+          <w:b/>
+          <w:bCs/>
         </w:rPr>
         <w:t xml:space="preserve">Pushed to git hub </w:t>
       </w:r>

</xml_diff>